<commit_message>
Show which user added the job in the new-job alert email
</commit_message>
<xml_diff>
--- a/MB2_Core_Overview.docx
+++ b/MB2_Core_Overview.docx
@@ -156,7 +156,7 @@
         <w:t xml:space="preserve"> </w:t>
       </w:r>
       <w:r>
-        <w:t xml:space="preserve">— estimates, approvals, authorizations, and other files attached to each job</w:t>
+        <w:t xml:space="preserve">— estimates, approvals, authorizations, vendor invoices, and other files attached to each job (each can carry an optional dollar amount)</w:t>
       </w:r>
     </w:p>
     <w:p>
@@ -171,6 +171,27 @@
         <w:rPr>
           <w:b/>
         </w:rPr>
+        <w:t xml:space="preserve">Job costs</w:t>
+      </w:r>
+      <w:r>
+        <w:t xml:space="preserve"> </w:t>
+      </w:r>
+      <w:r>
+        <w:t xml:space="preserve">— receipts and document amounts combine into a real, running cost per job</w:t>
+      </w:r>
+    </w:p>
+    <w:p>
+      <w:pPr>
+        <w:numPr>
+          <w:ilvl w:val="0"/>
+          <w:numId w:val="1001"/>
+        </w:numPr>
+        <w:pStyle w:val="Compact"/>
+      </w:pPr>
+      <w:r>
+        <w:rPr>
+          <w:b/>
+        </w:rPr>
         <w:t xml:space="preserve">Communication</w:t>
       </w:r>
       <w:r>
@@ -202,7 +223,7 @@
         <w:pStyle w:val="FirstParagraph"/>
       </w:pPr>
       <w:r>
-        <w:t xml:space="preserve">Every person who uses MB2 Core has one of three roles. The role controls what they can see and do. This keeps the field experience simple and protects sensitive information like financials.</w:t>
+        <w:t xml:space="preserve">Every person who uses MB2 Core has one of three roles. The role controls what they can see and do. This keeps the field experience simple and protects sensitive information like financials. Users will never be deleted to prevent data loss (time tracking and receipts), instead just deactivated if a user leaves the company.</w:t>
       </w:r>
     </w:p>
     <w:p>
@@ -220,22 +241,7 @@
         <w:pStyle w:val="FirstParagraph"/>
       </w:pPr>
       <w:r>
-        <w:t xml:space="preserve">Full access to everything,</w:t>
-      </w:r>
-      <w:r>
-        <w:t xml:space="preserve"> </w:t>
-      </w:r>
-      <w:r>
-        <w:rPr>
-          <w:b/>
-        </w:rPr>
-        <w:t xml:space="preserve">plus</w:t>
-      </w:r>
-      <w:r>
-        <w:t xml:space="preserve"> </w:t>
-      </w:r>
-      <w:r>
-        <w:t xml:space="preserve">the ability to manage users (add people, set roles, deactivate departed staff) and send/preview the automated emails. Admins are typically ownership and system managers.</w:t>
+        <w:t xml:space="preserve">Full access to everything, plus the ability to manage users (add people, set roles, deactivate departed staff) and send/preview the automated emails. Admins are typically ownership and system managers.</w:t>
       </w:r>
     </w:p>
     <w:p>
@@ -271,49 +277,7 @@
         <w:pStyle w:val="FirstParagraph"/>
       </w:pPr>
       <w:r>
-        <w:t xml:space="preserve">A streamlined, mobile-first experience focused on what a crew member needs on site:</w:t>
-      </w:r>
-      <w:r>
-        <w:t xml:space="preserve"> </w:t>
-      </w:r>
-      <w:r>
-        <w:rPr>
-          <w:b/>
-        </w:rPr>
-        <w:t xml:space="preserve">logging their time</w:t>
-      </w:r>
-      <w:r>
-        <w:t xml:space="preserve"> </w:t>
-      </w:r>
-      <w:r>
-        <w:t xml:space="preserve">and</w:t>
-      </w:r>
-      <w:r>
-        <w:t xml:space="preserve"> </w:t>
-      </w:r>
-      <w:r>
-        <w:rPr>
-          <w:b/>
-        </w:rPr>
-        <w:t xml:space="preserve">capturing receipts</w:t>
-      </w:r>
-      <w:r>
-        <w:t xml:space="preserve">. Field staff can view the jobs they're working, but only the essentials — job info, status, customer, key dates, and next steps. They do</w:t>
-      </w:r>
-      <w:r>
-        <w:t xml:space="preserve"> </w:t>
-      </w:r>
-      <w:r>
-        <w:rPr>
-          <w:b/>
-        </w:rPr>
-        <w:t xml:space="preserve">not</w:t>
-      </w:r>
-      <w:r>
-        <w:t xml:space="preserve"> </w:t>
-      </w:r>
-      <w:r>
-        <w:t xml:space="preserve">see financials, payroll, or other employees' information.</w:t>
+        <w:t xml:space="preserve">A streamlined, mobile-first experience focused on what a crew member needs on site: logging their time and capturing receipts. Field staff can view the jobs they're working, but only the essentials — job info, status, customer, key dates, and next steps. They do not see financials, payroll, or other employees' information.</w:t>
       </w:r>
     </w:p>
     <w:tbl>
@@ -991,7 +955,7 @@
         <w:t xml:space="preserve"> </w:t>
       </w:r>
       <w:r>
-        <w:t xml:space="preserve">— expenses captured for the job</w:t>
+        <w:t xml:space="preserve">— expenses captured for the job (typically credit-card purchases)</w:t>
       </w:r>
     </w:p>
     <w:p>
@@ -1012,7 +976,7 @@
         <w:t xml:space="preserve"> </w:t>
       </w:r>
       <w:r>
-        <w:t xml:space="preserve">— estimates, approvals, authorizations, and other attached files</w:t>
+        <w:t xml:space="preserve">— estimates, approvals, authorizations, vendor invoices, and other attached files; each can carry an optional dollar amount that counts toward the job's cost</w:t>
       </w:r>
     </w:p>
     <w:p>
@@ -1423,10 +1387,13 @@
         <w:rPr>
           <w:b/>
         </w:rPr>
-        <w:t xml:space="preserve">All office and admin staff immediately receive a "New Job Added" email</w:t>
-      </w:r>
-      <w:r>
-        <w:t xml:space="preserve">, so the team and ownership always know the moment a job enters the pipeline.</w:t>
+        <w:t xml:space="preserve">All Admins and Office users immediately receive a "New Job Added" email</w:t>
+      </w:r>
+      <w:r>
+        <w:t xml:space="preserve"> </w:t>
+      </w:r>
+      <w:r>
+        <w:t xml:space="preserve">(including those initial notes), so staff always know the moment a job enters the pipeline and have the context to act.</w:t>
       </w:r>
     </w:p>
     <w:p>
@@ -1459,7 +1426,7 @@
         <w:t xml:space="preserve"> </w:t>
       </w:r>
       <w:r>
-        <w:t xml:space="preserve">list, staff can search, filter (by status or type), and sort to find any job. Opening a job shows everything about it on one page. As the job progresses, office/admin update its status, add Project Notes to log developments, fill in dates and financials, and attach documents.</w:t>
+        <w:t xml:space="preserve">list, staff can search, filter (by status or type), and sort to find any job. Opening a job shows everything about it on one page. As the job progresses, Admin / Office users update its status, add Project Notes to log developments (also allowed by Field Staff), fill in dates and financials, and attach documents. Longer sections like Notes, Time, and Expenses collapse to the latest entry and expand on demand, so a busy job stays easy to scan.</w:t>
       </w:r>
     </w:p>
     <w:p>
@@ -1500,7 +1467,7 @@
         <w:pStyle w:val="FirstParagraph"/>
       </w:pPr>
       <w:r>
-        <w:t xml:space="preserve">Field staff (and office/admin for themselves) log time on a</w:t>
+        <w:t xml:space="preserve">Field staff (and Admin / Office users for themselves) log time on a</w:t>
       </w:r>
       <w:r>
         <w:t xml:space="preserve"> </w:t>
@@ -1553,16 +1520,16 @@
         <w:pStyle w:val="FirstParagraph"/>
       </w:pPr>
       <w:r>
-        <w:t xml:space="preserve">Out in the field, crew members snap a photo of a receipt, assign it to a job, and enter the vendor, amount, and a note. Photos are compressed on the device so they upload fast even on weak signal. Receipts roll up as job expenses and can be exported, giving a real picture of costs per job.</w:t>
+        <w:t xml:space="preserve">Out in the field, crew members snap a photo of a receipt, assign it to a job, and enter the vendor, amount, and a note. Photos are compressed on the device so they upload fast even on weak signal and keep file storage costs low. Receipts capture the credit-card side of a job's spending. A receipt can be reassigned to a different job if it's logged to the wrong one.</w:t>
       </w:r>
     </w:p>
     <w:p>
       <w:pPr>
         <w:pStyle w:val="Heading3"/>
       </w:pPr>
-      <w:bookmarkStart w:id="33" w:name="Xe8068282dd1f1ee1ec13da90dce457a19a7d071"/>
-      <w:r>
-        <w:t xml:space="preserve">5. Documents</w:t>
+      <w:bookmarkStart w:id="33" w:name="X8a3aa8cc5562f6450059a7f3853083364c0d657"/>
+      <w:r>
+        <w:t xml:space="preserve">5. Documents &amp; Vendor Costs</w:t>
       </w:r>
       <w:bookmarkEnd w:id="33"/>
     </w:p>
@@ -1571,7 +1538,83 @@
         <w:pStyle w:val="FirstParagraph"/>
       </w:pPr>
       <w:r>
-        <w:t xml:space="preserve">Office and admin attach files to a job — PDFs, images, or Word documents — for estimates, customer approvals, authorizations, satisfaction forms, and the like. Each document gets a short description and is listed with its date and a link to view it. This keeps the paper trail for a job in one place, accessible to the whole office team.</w:t>
+        <w:t xml:space="preserve">Office and admin attach files to a job — PDFs, images, or Word documents — for estimates, customer approvals, authorizations, satisfaction forms, and</w:t>
+      </w:r>
+      <w:r>
+        <w:t xml:space="preserve"> </w:t>
+      </w:r>
+      <w:r>
+        <w:rPr>
+          <w:b/>
+        </w:rPr>
+        <w:t xml:space="preserve">vendor or subcontractor invoices</w:t>
+      </w:r>
+      <w:r>
+        <w:t xml:space="preserve"> </w:t>
+      </w:r>
+      <w:r>
+        <w:t xml:space="preserve">(flooring, electrical, plumbing, carpet, and the like). Each document gets a short description, a date, and a link to view it, all in one place.</w:t>
+      </w:r>
+    </w:p>
+    <w:p>
+      <w:pPr>
+        <w:pStyle w:val="BodyText"/>
+      </w:pPr>
+      <w:r>
+        <w:t xml:space="preserve">Critically,</w:t>
+      </w:r>
+      <w:r>
+        <w:t xml:space="preserve"> </w:t>
+      </w:r>
+      <w:r>
+        <w:rPr>
+          <w:b/>
+        </w:rPr>
+        <w:t xml:space="preserve">each document can carry an optional dollar amount.</w:t>
+      </w:r>
+      <w:r>
+        <w:t xml:space="preserve"> </w:t>
+      </w:r>
+      <w:r>
+        <w:t xml:space="preserve">This is how MB2 captures the costs that</w:t>
+      </w:r>
+      <w:r>
+        <w:t xml:space="preserve"> </w:t>
+      </w:r>
+      <w:r>
+        <w:rPr>
+          <w:i/>
+        </w:rPr>
+        <w:t xml:space="preserve">don't</w:t>
+      </w:r>
+      <w:r>
+        <w:t xml:space="preserve"> </w:t>
+      </w:r>
+      <w:r>
+        <w:t xml:space="preserve">go on a credit card — a subcontractor's bill or a materials quote uploaded as a PDF now contributes to the job's cost, not just its paper trail.</w:t>
+      </w:r>
+    </w:p>
+    <w:p>
+      <w:pPr>
+        <w:pStyle w:val="BodyText"/>
+      </w:pPr>
+      <w:r>
+        <w:t xml:space="preserve">Together, receipts and document amounts give the</w:t>
+      </w:r>
+      <w:r>
+        <w:t xml:space="preserve"> </w:t>
+      </w:r>
+      <w:r>
+        <w:rPr>
+          <w:b/>
+        </w:rPr>
+        <w:t xml:space="preserve">Total Job Costs</w:t>
+      </w:r>
+      <w:r>
+        <w:t xml:space="preserve"> </w:t>
+      </w:r>
+      <w:r>
+        <w:t xml:space="preserve">for a job: the credit-card purchases (receipts) plus the vendor and subcontractor bills (documents), added into one running total on the job — with the breakdown of each visible. That's the complete cost of a job, in one place, as work happens.</w:t>
       </w:r>
     </w:p>
     <w:p>
@@ -1679,7 +1722,7 @@
         <w:t xml:space="preserve"> </w:t>
       </w:r>
       <w:r>
-        <w:t xml:space="preserve">— office and admin staff get an instant new-job alert.</w:t>
+        <w:t xml:space="preserve">— office and admin staff get an instant new-job alert, including the job's initial notes.</w:t>
       </w:r>
     </w:p>
     <w:p>
@@ -1781,13 +1824,28 @@
         <w:rPr>
           <w:b/>
         </w:rPr>
-        <w:t xml:space="preserve">Job-cost visibility.</w:t>
-      </w:r>
-      <w:r>
-        <w:t xml:space="preserve"> </w:t>
-      </w:r>
-      <w:r>
-        <w:t xml:space="preserve">Because receipts and hours are captured against each job as work happens, MB2 can see the real cost of a project — not reconstruct it weeks later from a shoebox of receipts.</w:t>
+        <w:t xml:space="preserve">True job-cost visibility.</w:t>
+      </w:r>
+      <w:r>
+        <w:t xml:space="preserve"> </w:t>
+      </w:r>
+      <w:r>
+        <w:t xml:space="preserve">Because both sides of spending are captured against the job as work happens — credit-card receipts from the field</w:t>
+      </w:r>
+      <w:r>
+        <w:t xml:space="preserve"> </w:t>
+      </w:r>
+      <w:r>
+        <w:rPr>
+          <w:i/>
+        </w:rPr>
+        <w:t xml:space="preserve">and</w:t>
+      </w:r>
+      <w:r>
+        <w:t xml:space="preserve"> </w:t>
+      </w:r>
+      <w:r>
+        <w:t xml:space="preserve">vendor/subcontractor invoices uploaded as documents with amounts — MB2 sees the real, complete cost of a project in real time, not reconstructed weeks later from a shoebox of receipts and a stack of invoices.</w:t>
       </w:r>
     </w:p>
     <w:p>
@@ -1804,7 +1862,7 @@
         <w:t xml:space="preserve"> </w:t>
       </w:r>
       <w:r>
-        <w:t xml:space="preserve">Estimate, signed authorization, before/after photos, notes, time, and costs all live on the one job. If a question comes up months later — from a customer, an insurer, or an auditor — the whole history is in one place.</w:t>
+        <w:t xml:space="preserve">Estimate, signed authorization, before/after photos, vendor invoices, notes, time, and costs all live on the one job. If a question comes up months later — from a customer, an insurer, or an auditor — the whole history is in one place.</w:t>
       </w:r>
     </w:p>
     <w:p>

</xml_diff>